<commit_message>
Keep the published portfolio while refreshing recruiter materials
Constraint: Restore all website code to origin/main before replacing only the resume assets supplied by Jisung.

Rejected: Retaining the experimental Living Data Spine on main | Jisung asked to return to the GitHub version for now.

Confidence: high

Scope-risk: narrow

Directive: The experimental redesign remains recoverable from backup/living-data-spine-20260908.

Tested: Source and destination SHA-256 hashes match; DOCX archive contains word/document.xml; PDF header is valid and serves over HTTP 200 as application/pdf.

Not-tested: GitHub Pages deployment because no push was authorized.
</commit_message>
<xml_diff>
--- a/Files/JisungWoo_Resume.docx
+++ b/Files/JisungWoo_Resume.docx
@@ -206,29 +206,7 @@
           <w:szCs w:val="20"/>
           <w:lang w:eastAsia="ko-KR"/>
         </w:rPr>
-        <w:t>linkedin.com/in/</w:t>
-      </w:r>
-      <w:proofErr w:type="spellStart"/>
-      <w:r>
-        <w:rPr>
-          <w:rFonts w:eastAsiaTheme="minorEastAsia"/>
-          <w:spacing w:val="-2"/>
-          <w:sz w:val="20"/>
-          <w:szCs w:val="20"/>
-          <w:lang w:eastAsia="ko-KR"/>
-        </w:rPr>
-        <w:t>jisung</w:t>
-      </w:r>
-      <w:proofErr w:type="spellEnd"/>
-      <w:r>
-        <w:rPr>
-          <w:rFonts w:eastAsiaTheme="minorEastAsia"/>
-          <w:spacing w:val="-2"/>
-          <w:sz w:val="20"/>
-          <w:szCs w:val="20"/>
-          <w:lang w:eastAsia="ko-KR"/>
-        </w:rPr>
-        <w:t>-woo</w:t>
+        <w:t>linkedin.com/in/jisung-woo</w:t>
       </w:r>
       <w:r>
         <w:rPr>
@@ -291,6 +269,7 @@
         <w:ind w:right="10"/>
         <w:rPr>
           <w:rFonts w:eastAsiaTheme="minorEastAsia"/>
+          <w:noProof/>
           <w:lang w:eastAsia="ko-KR"/>
         </w:rPr>
       </w:pPr>
@@ -377,7 +356,35 @@
         <w:rPr>
           <w:noProof/>
         </w:rPr>
-        <w:t>DATA ENGINEER</w:t>
+        <w:t>DATA ENGINEER | SNOWFLAKE | DATA ARCHITECTURE &amp; DELIVERY</w:t>
+      </w:r>
+    </w:p>
+    <w:p>
+      <w:pPr>
+        <w:pStyle w:val="Heading1"/>
+        <w:tabs>
+          <w:tab w:val="right" w:pos="10980"/>
+        </w:tabs>
+        <w:ind w:right="10"/>
+        <w:rPr>
+          <w:rFonts w:eastAsiaTheme="minorEastAsia"/>
+          <w:b w:val="0"/>
+          <w:bCs w:val="0"/>
+          <w:sz w:val="20"/>
+          <w:szCs w:val="20"/>
+          <w:lang w:eastAsia="ko-KR"/>
+        </w:rPr>
+      </w:pPr>
+      <w:r>
+        <w:rPr>
+          <w:rFonts w:eastAsiaTheme="minorEastAsia"/>
+          <w:b w:val="0"/>
+          <w:bCs w:val="0"/>
+          <w:sz w:val="20"/>
+          <w:szCs w:val="20"/>
+          <w:lang w:eastAsia="ko-KR"/>
+        </w:rPr>
+        <w:t>Data Engineer with 5+ years delivering governed Snowflake, SQL Server, and Azure data solutions in regulated enterprise environments. Lead executive-facing initiatives from ambiguous business requirements through data architecture, distributed development, QA, UAT, and production readiness. Combine complex SQL debugging, performance optimization, and applied Snowflake AI to deliver reliable analytics and accelerate technical delivery.</w:t>
       </w:r>
     </w:p>
     <w:p>
@@ -402,93 +409,8 @@
           <w:szCs w:val="20"/>
           <w:lang w:eastAsia="ko-KR"/>
         </w:rPr>
-        <w:t>Data Engineer with 5+ years delivering enterprise data solutions across Snowflake, SQL Server, and Azure in regulated environments.</w:t>
-      </w:r>
-    </w:p>
-    <w:p>
-      <w:pPr>
-        <w:tabs>
-          <w:tab w:val="right" w:pos="10980"/>
-        </w:tabs>
-        <w:ind w:left="144" w:right="10"/>
-        <w:rPr>
-          <w:rFonts w:eastAsiaTheme="minorEastAsia"/>
-          <w:bCs/>
-          <w:sz w:val="20"/>
-          <w:szCs w:val="20"/>
-          <w:lang w:eastAsia="ko-KR"/>
-        </w:rPr>
-      </w:pPr>
-      <w:r>
-        <w:rPr>
-          <w:rFonts w:eastAsiaTheme="minorEastAsia"/>
-          <w:bCs/>
-          <w:sz w:val="20"/>
-          <w:szCs w:val="20"/>
-          <w:lang w:eastAsia="ko-KR"/>
-        </w:rPr>
-        <w:t>Translate executive and director-level priorities into data models, technical requirements, validation plans, and release-ready solutions.</w:t>
-      </w:r>
-    </w:p>
-    <w:p>
-      <w:pPr>
-        <w:tabs>
-          <w:tab w:val="right" w:pos="10980"/>
-        </w:tabs>
-        <w:ind w:left="144" w:right="10"/>
-        <w:rPr>
-          <w:rFonts w:eastAsiaTheme="minorEastAsia"/>
-          <w:bCs/>
-          <w:sz w:val="20"/>
-          <w:szCs w:val="20"/>
-          <w:lang w:eastAsia="ko-KR"/>
-        </w:rPr>
-      </w:pPr>
-      <w:r>
-        <w:rPr>
-          <w:rFonts w:eastAsiaTheme="minorEastAsia"/>
-          <w:bCs/>
-          <w:sz w:val="20"/>
-          <w:szCs w:val="20"/>
-          <w:lang w:eastAsia="ko-KR"/>
-        </w:rPr>
-        <w:t>Lead distributed engineering delivery while remaining hands-on in solution architecture, complex SQL debugging, restricted-data QA, and</w:t>
-      </w:r>
-      <w:r>
-        <w:rPr>
-          <w:rFonts w:eastAsiaTheme="minorEastAsia" w:hint="eastAsia"/>
-          <w:bCs/>
-          <w:sz w:val="20"/>
-          <w:szCs w:val="20"/>
-          <w:lang w:eastAsia="ko-KR"/>
-        </w:rPr>
-        <w:t xml:space="preserve"> </w:t>
-      </w:r>
-      <w:r>
-        <w:rPr>
-          <w:rFonts w:eastAsiaTheme="minorEastAsia"/>
-          <w:bCs/>
-          <w:sz w:val="20"/>
-          <w:szCs w:val="20"/>
-          <w:lang w:eastAsia="ko-KR"/>
-        </w:rPr>
-        <w:t>Snowflake Cortex Agent development.</w:t>
-      </w:r>
-    </w:p>
-    <w:p>
-      <w:pPr>
-        <w:tabs>
-          <w:tab w:val="right" w:pos="10980"/>
-        </w:tabs>
-        <w:ind w:right="10"/>
-        <w:rPr>
-          <w:rFonts w:eastAsiaTheme="minorEastAsia"/>
-          <w:bCs/>
-          <w:sz w:val="20"/>
-          <w:szCs w:val="20"/>
-          <w:lang w:eastAsia="ko-KR"/>
-        </w:rPr>
-      </w:pPr>
+        <w:tab/>
+      </w:r>
     </w:p>
     <w:p>
       <w:pPr>
@@ -708,7 +630,7 @@
           <w:szCs w:val="20"/>
           <w:lang w:eastAsia="ko-KR"/>
         </w:rPr>
-        <w:t>Lead data delivery for executive-facing analytics initiatives, partnering with directors, senior directors, and cross-functional teams to define metrics, resolve ambiguity, and translate leadership needs into Snowflake solutions</w:t>
+        <w:t>Reduced the full-load runtime of a multi-layer Snowflake pipeline supporting a 10M+ row, 200+ column data model from up to three hours to 30 minutes, an 83% runtime reduction, by replacing expensive nested-view dependencies, removing unnecessary joins and CTEs, and limiting transformations to required columns.</w:t>
       </w:r>
     </w:p>
     <w:p>
@@ -739,7 +661,7 @@
           <w:szCs w:val="20"/>
           <w:lang w:eastAsia="ko-KR"/>
         </w:rPr>
-        <w:t>Co-design greenfield data models and solution architecture for an Executive Cockpit with the enterprise data architect, defining source mappings, business logic, data grain, and acceptance criteria before development handoff.</w:t>
+        <w:t>Lead technical delivery for executive-facing analytics initiatives, partnering directly with directors, senior leaders, finance, supply chain, and EDW teams to translate ambiguous business priorities into governed Snowflake solutions.</w:t>
       </w:r>
     </w:p>
     <w:p>
@@ -770,25 +692,7 @@
           <w:szCs w:val="20"/>
           <w:lang w:eastAsia="ko-KR"/>
         </w:rPr>
-        <w:t>Build and iterate a Snowflake Cortex Agent for the Executive Cockpit, connecting governed EDW data so leaders can ask natural</w:t>
-      </w:r>
-      <w:r>
-        <w:rPr>
-          <w:rFonts w:eastAsiaTheme="minorEastAsia" w:hint="eastAsia"/>
-          <w:sz w:val="20"/>
-          <w:szCs w:val="20"/>
-          <w:lang w:eastAsia="ko-KR"/>
-        </w:rPr>
-        <w:t>-</w:t>
-      </w:r>
-      <w:r>
-        <w:rPr>
-          <w:rFonts w:eastAsiaTheme="minorEastAsia"/>
-          <w:sz w:val="20"/>
-          <w:szCs w:val="20"/>
-          <w:lang w:eastAsia="ko-KR"/>
-        </w:rPr>
-        <w:t>language questions alongside dashboard analysis.</w:t>
+        <w:t>Co-design the greenfield EDW architecture and data model for Executive Cockpit with the enterprise data architect, defining source mappings, business logic, grain, acceptance criteria, and phased ingestion requirements.</w:t>
       </w:r>
     </w:p>
     <w:p>
@@ -819,7 +723,16 @@
           <w:szCs w:val="20"/>
           <w:lang w:eastAsia="ko-KR"/>
         </w:rPr>
-        <w:t>Direct delivery across a distributed offshore engineering team by converting business requirements into technical stories, clarifying implementation logic, reviewing results, resolving blockers, and coordinating release readiness.</w:t>
+        <w:t>Coordinate delivery across global engineering workstreams, typically guiding 2–5 engineers per initiative through designated DE leads and supporting concurrent projects across a broader pool of approximately 12 engineers</w:t>
+      </w:r>
+      <w:r>
+        <w:rPr>
+          <w:rFonts w:eastAsiaTheme="minorEastAsia"/>
+          <w:sz w:val="20"/>
+          <w:szCs w:val="20"/>
+          <w:lang w:eastAsia="ko-KR"/>
+        </w:rPr>
+        <w:t>.</w:t>
       </w:r>
     </w:p>
     <w:p>
@@ -850,7 +763,7 @@
           <w:szCs w:val="20"/>
           <w:lang w:eastAsia="ko-KR"/>
         </w:rPr>
-        <w:t>Serve as the restricted-data validation authority for QA and production: execute workflows, validate outputs, diagnose duplicate or missing values in SQL definitions spanning thousands of lines, and provide code-level remediation guidance.</w:t>
+        <w:t>Serve as a primary restricted-data QA validation partner for global engineers without environment access, executing workflows, diagnosing duplicates and missing values, and coordinating release readiness across 20+ enterprise data models, with deep ownership of three complex finance, purchasing, and operational models.</w:t>
       </w:r>
     </w:p>
     <w:p>
@@ -879,7 +792,7 @@
           <w:sz w:val="20"/>
           <w:szCs w:val="20"/>
         </w:rPr>
-        <w:t>Present solution direction, delivery status, risks, and data-quality findings to director- and VP-level stakeholders, aligning business expectations with architecture and engineering constraints</w:t>
+        <w:t>Developed a Snowflake Cortex Agent prototype for technical metadata automation that generates business definitions and source-to-target lineage for hundreds of columns, achieving approximately 90% mapping accuracy in initial testing and reducing draft preparation time from 4+ hours to minutes.</w:t>
       </w:r>
     </w:p>
     <w:p>
@@ -895,8 +808,10 @@
         <w:ind w:left="360" w:right="10" w:firstLine="0"/>
         <w:contextualSpacing/>
         <w:rPr>
-          <w:sz w:val="20"/>
-          <w:szCs w:val="20"/>
+          <w:rFonts w:eastAsiaTheme="minorEastAsia"/>
+          <w:sz w:val="20"/>
+          <w:szCs w:val="20"/>
+          <w:lang w:eastAsia="ko-KR"/>
         </w:rPr>
       </w:pPr>
     </w:p>
@@ -1041,7 +956,7 @@
           <w:sz w:val="20"/>
           <w:szCs w:val="20"/>
         </w:rPr>
-        <w:t>Modernized ETL/ELT workflows with SSIS, Azure Data Factory, and SQL Server, integrating Salesforce, Workday, and Azure Blob Storage into the enterprise data warehouse.</w:t>
+        <w:t>Modernized enterprise ETL/ELT pipelines across Salesforce, Workday, and Azure Blob Storage using SSIS, Azure Data Factory, and SQL Server, centralizing cross-system data for analytics and reporting.</w:t>
       </w:r>
     </w:p>
     <w:p>
@@ -1070,7 +985,7 @@
           <w:sz w:val="20"/>
           <w:szCs w:val="20"/>
         </w:rPr>
-        <w:t>Built stored procedures and data-quality routines that automated Power BI refreshes, resolved duplicate records, improved reporting reliability, and reduced complex DAX dependencies.</w:t>
+        <w:t>Developed SQL Server stored procedures and automated data-quality checks that resolved duplicate records, improved Power BI refresh reliability, and replaced complex report-level DAX with governed warehouse logic.</w:t>
       </w:r>
     </w:p>
     <w:p>
@@ -1086,8 +1001,10 @@
         <w:ind w:left="360" w:right="10" w:firstLine="0"/>
         <w:contextualSpacing/>
         <w:rPr>
-          <w:sz w:val="20"/>
-          <w:szCs w:val="20"/>
+          <w:rFonts w:eastAsiaTheme="minorEastAsia"/>
+          <w:sz w:val="20"/>
+          <w:szCs w:val="20"/>
+          <w:lang w:eastAsia="ko-KR"/>
         </w:rPr>
       </w:pPr>
     </w:p>
@@ -1376,7 +1293,7 @@
           <w:szCs w:val="20"/>
           <w:lang w:eastAsia="ko-KR"/>
         </w:rPr>
-        <w:t>Founder / Full-Stack AI Product Engineer</w:t>
+        <w:t>Founder</w:t>
       </w:r>
       <w:r>
         <w:rPr>
@@ -1454,6 +1371,36 @@
           <w:lang w:eastAsia="ko-KR"/>
         </w:rPr>
         <w:t>MelodyMap.ai</w:t>
+      </w:r>
+      <w:r>
+        <w:rPr>
+          <w:rFonts w:eastAsiaTheme="minorEastAsia" w:hint="eastAsia"/>
+          <w:bCs/>
+          <w:sz w:val="20"/>
+          <w:szCs w:val="20"/>
+          <w:lang w:eastAsia="ko-KR"/>
+        </w:rPr>
+        <w:t xml:space="preserve"> </w:t>
+      </w:r>
+      <w:r>
+        <w:rPr>
+          <w:rFonts w:eastAsiaTheme="minorEastAsia"/>
+          <w:bCs/>
+          <w:sz w:val="20"/>
+          <w:szCs w:val="20"/>
+          <w:lang w:eastAsia="ko-KR"/>
+        </w:rPr>
+        <w:t>–</w:t>
+      </w:r>
+      <w:r>
+        <w:rPr>
+          <w:rFonts w:eastAsiaTheme="minorEastAsia" w:hint="eastAsia"/>
+          <w:bCs/>
+          <w:sz w:val="20"/>
+          <w:szCs w:val="20"/>
+          <w:lang w:eastAsia="ko-KR"/>
+        </w:rPr>
+        <w:t xml:space="preserve"> qa.MelodyMap.ai</w:t>
       </w:r>
     </w:p>
     <w:p>
@@ -1519,29 +1466,7 @@
           <w:szCs w:val="20"/>
           <w:lang w:eastAsia="ko-KR"/>
         </w:rPr>
-        <w:t xml:space="preserve">Architected a layered system with Next.js, </w:t>
-      </w:r>
-      <w:proofErr w:type="spellStart"/>
-      <w:r>
-        <w:rPr>
-          <w:rFonts w:eastAsiaTheme="minorEastAsia"/>
-          <w:bCs/>
-          <w:sz w:val="20"/>
-          <w:szCs w:val="20"/>
-          <w:lang w:eastAsia="ko-KR"/>
-        </w:rPr>
-        <w:t>FastAPI</w:t>
-      </w:r>
-      <w:proofErr w:type="spellEnd"/>
-      <w:r>
-        <w:rPr>
-          <w:rFonts w:eastAsiaTheme="minorEastAsia"/>
-          <w:bCs/>
-          <w:sz w:val="20"/>
-          <w:szCs w:val="20"/>
-          <w:lang w:eastAsia="ko-KR"/>
-        </w:rPr>
-        <w:t xml:space="preserve">, PostgreSQL, and Gemini through a server-side model gateway, with structured outputs, auditability, and privacy-conscious data boundaries. </w:t>
+        <w:t xml:space="preserve">Architected a layered system with Next.js, FastAPI, PostgreSQL, and Gemini through a server-side model gateway, with structured outputs, auditability, and privacy-conscious data boundaries. </w:t>
       </w:r>
     </w:p>
     <w:p>
@@ -1694,7 +1619,6 @@
         <w:t>Snowflake, SQL, Data Modeling, ETL/ELT, Data Warehousing, SQL Server, Informatica, Control-M, Azure Data Factory, SSIS, Power BI</w:t>
       </w:r>
     </w:p>
-    <w:bookmarkEnd w:id="2"/>
     <w:p>
       <w:pPr>
         <w:pStyle w:val="BodyText"/>
@@ -1714,47 +1638,23 @@
       </w:pPr>
       <w:r>
         <w:rPr>
-          <w:rFonts w:eastAsiaTheme="minorEastAsia"/>
-          <w:b/>
-          <w:sz w:val="20"/>
-          <w:szCs w:val="20"/>
-          <w:lang w:eastAsia="ko-KR"/>
-        </w:rPr>
-        <w:t xml:space="preserve">AI &amp; Engineering: </w:t>
-      </w:r>
-      <w:r>
-        <w:rPr>
-          <w:rFonts w:eastAsiaTheme="minorEastAsia"/>
-          <w:bCs/>
-          <w:sz w:val="20"/>
-          <w:szCs w:val="20"/>
-          <w:lang w:eastAsia="ko-KR"/>
-        </w:rPr>
-        <w:t xml:space="preserve">Snowflake Cortex Agents, Python, Git, React, Next.js, </w:t>
-      </w:r>
-      <w:proofErr w:type="spellStart"/>
-      <w:r>
-        <w:rPr>
-          <w:rFonts w:eastAsiaTheme="minorEastAsia"/>
-          <w:bCs/>
-          <w:sz w:val="20"/>
-          <w:szCs w:val="20"/>
-          <w:lang w:eastAsia="ko-KR"/>
-        </w:rPr>
-        <w:t>FastAPI</w:t>
-      </w:r>
-      <w:proofErr w:type="spellEnd"/>
-      <w:r>
-        <w:rPr>
-          <w:rFonts w:eastAsiaTheme="minorEastAsia"/>
-          <w:bCs/>
-          <w:sz w:val="20"/>
-          <w:szCs w:val="20"/>
-          <w:lang w:eastAsia="ko-KR"/>
-        </w:rPr>
-        <w:t>, PostgreSQL, Gemini, Claude, Codex</w:t>
-      </w:r>
-    </w:p>
+          <w:b/>
+          <w:bCs/>
+          <w:sz w:val="20"/>
+          <w:szCs w:val="20"/>
+        </w:rPr>
+        <w:t>Engineering Practices:</w:t>
+      </w:r>
+      <w:r>
+        <w:rPr>
+          <w:bCs/>
+          <w:sz w:val="20"/>
+          <w:szCs w:val="20"/>
+        </w:rPr>
+        <w:t xml:space="preserve"> SQL Performance Tuning, Data Quality, Source-to-Target Mapping, Data Lineage, Git</w:t>
+      </w:r>
+    </w:p>
+    <w:bookmarkEnd w:id="2"/>
     <w:p>
       <w:pPr>
         <w:pStyle w:val="BodyText"/>
@@ -1776,21 +1676,32 @@
         <w:rPr>
           <w:rFonts w:eastAsiaTheme="minorEastAsia"/>
           <w:b/>
-          <w:sz w:val="20"/>
-          <w:szCs w:val="20"/>
-          <w:lang w:eastAsia="ko-KR"/>
-        </w:rPr>
-        <w:t xml:space="preserve">Leadership: </w:t>
-      </w:r>
-      <w:r>
-        <w:rPr>
-          <w:rFonts w:eastAsiaTheme="minorEastAsia"/>
-          <w:bCs/>
-          <w:sz w:val="20"/>
-          <w:szCs w:val="20"/>
-          <w:lang w:eastAsia="ko-KR"/>
-        </w:rPr>
-        <w:t>Solution Architecture, Executive Stakeholder Communication, Distributed Delivery, Requirements Translation, QA and Data Validation</w:t>
+          <w:bCs/>
+          <w:sz w:val="20"/>
+          <w:szCs w:val="20"/>
+          <w:lang w:eastAsia="ko-KR"/>
+        </w:rPr>
+        <w:t>Applied AI:</w:t>
+      </w:r>
+      <w:r>
+        <w:rPr>
+          <w:rFonts w:eastAsiaTheme="minorEastAsia"/>
+          <w:b/>
+          <w:sz w:val="20"/>
+          <w:szCs w:val="20"/>
+          <w:lang w:eastAsia="ko-KR"/>
+        </w:rPr>
+        <w:t xml:space="preserve"> </w:t>
+      </w:r>
+      <w:r>
+        <w:rPr>
+          <w:rFonts w:eastAsiaTheme="minorEastAsia"/>
+          <w:bCs/>
+          <w:sz w:val="20"/>
+          <w:szCs w:val="20"/>
+          <w:lang w:eastAsia="ko-KR"/>
+        </w:rPr>
+        <w:t>Snowflake Cortex Agents, Gemini, AI-Assisted Product Development</w:t>
       </w:r>
     </w:p>
     <w:p>
@@ -1812,6 +1723,44 @@
       </w:pPr>
       <w:r>
         <w:rPr>
+          <w:rFonts w:eastAsiaTheme="minorEastAsia"/>
+          <w:b/>
+          <w:sz w:val="20"/>
+          <w:szCs w:val="20"/>
+          <w:lang w:eastAsia="ko-KR"/>
+        </w:rPr>
+        <w:t xml:space="preserve">Leadership: </w:t>
+      </w:r>
+      <w:r>
+        <w:rPr>
+          <w:rFonts w:eastAsiaTheme="minorEastAsia"/>
+          <w:bCs/>
+          <w:sz w:val="20"/>
+          <w:szCs w:val="20"/>
+          <w:lang w:eastAsia="ko-KR"/>
+        </w:rPr>
+        <w:t>Solution Architecture, Executive Stakeholder Communication, Distributed Delivery, Requirements Translation, QA and Data Validation</w:t>
+      </w:r>
+    </w:p>
+    <w:p>
+      <w:pPr>
+        <w:pStyle w:val="BodyText"/>
+        <w:numPr>
+          <w:ilvl w:val="0"/>
+          <w:numId w:val="3"/>
+        </w:numPr>
+        <w:tabs>
+          <w:tab w:val="right" w:pos="10980"/>
+        </w:tabs>
+        <w:ind w:left="360" w:right="10" w:hanging="180"/>
+        <w:rPr>
+          <w:bCs/>
+          <w:sz w:val="20"/>
+          <w:szCs w:val="20"/>
+        </w:rPr>
+      </w:pPr>
+      <w:r>
+        <w:rPr>
           <w:rFonts w:eastAsiaTheme="minorEastAsia" w:hint="eastAsia"/>
           <w:b/>
           <w:sz w:val="20"/>
@@ -1834,43 +1783,7 @@
           <w:sz w:val="20"/>
           <w:szCs w:val="20"/>
         </w:rPr>
-        <w:t>English (</w:t>
-      </w:r>
-      <w:r>
-        <w:rPr>
-          <w:rFonts w:eastAsiaTheme="minorEastAsia" w:hint="eastAsia"/>
-          <w:bCs/>
-          <w:sz w:val="20"/>
-          <w:szCs w:val="20"/>
-          <w:lang w:eastAsia="ko-KR"/>
-        </w:rPr>
-        <w:t>Native</w:t>
-      </w:r>
-      <w:r>
-        <w:rPr>
-          <w:bCs/>
-          <w:sz w:val="20"/>
-          <w:szCs w:val="20"/>
-        </w:rPr>
-        <w:t>), Korean (</w:t>
-      </w:r>
-      <w:r>
-        <w:rPr>
-          <w:rFonts w:eastAsiaTheme="minorEastAsia" w:hint="eastAsia"/>
-          <w:bCs/>
-          <w:sz w:val="20"/>
-          <w:szCs w:val="20"/>
-          <w:lang w:eastAsia="ko-KR"/>
-        </w:rPr>
-        <w:t>Native</w:t>
-      </w:r>
-      <w:r>
-        <w:rPr>
-          <w:bCs/>
-          <w:sz w:val="20"/>
-          <w:szCs w:val="20"/>
-        </w:rPr>
-        <w:t>)</w:t>
+        <w:t>English and Korean — Native/Bilingual Proficiency</w:t>
       </w:r>
     </w:p>
     <w:p>
@@ -3193,6 +3106,7 @@
   <w:style w:type="character" w:default="1" w:styleId="DefaultParagraphFont">
     <w:name w:val="Default Paragraph Font"/>
     <w:uiPriority w:val="1"/>
+    <w:semiHidden/>
     <w:unhideWhenUsed/>
   </w:style>
   <w:style w:type="table" w:default="1" w:styleId="TableNormal">

</xml_diff>